<commit_message>
Add explicit dataset links in references across all manuscript formats
</commit_message>
<xml_diff>
--- a/paper.docx
+++ b/paper.docx
@@ -13306,7 +13306,7 @@
           <w:rFonts w:ascii="Times New Roman" w:hAnsi="Times New Roman"/>
           <w:sz w:val="16"/>
         </w:rPr>
-        <w:t>[25] Panzarasa, Pietro, Opsahl, Tore, and Carley, Kathleen M. 'Patterns and Dynamics of Users' Behavior and Interaction: Network Analysis of an Online Community.' In Journal of the American Society for Information Science and Technology, vol. 60, no. 5, pp. 911--932, 2009. [Online: https://snap.stanford.edu/data/CollegeMsg.html]</w:t>
+        <w:t>[25] Panzarasa, Pietro, Opsahl, Tore, and Carley, Kathleen M. 'Patterns and Dynamics of Users' Behavior and Interaction: Network Analysis of an Online Community.' In Journal of the American Society for Information Science and Technology, vol. 60, no. 5, pp. 911--932, 2009. [Dataset Link: https://snap.stanford.edu/data/CollegeMsg.html]</w:t>
       </w:r>
     </w:p>
     <w:p>
@@ -13318,7 +13318,7 @@
           <w:rFonts w:ascii="Times New Roman" w:hAnsi="Times New Roman"/>
           <w:sz w:val="16"/>
         </w:rPr>
-        <w:t>[26] Kumar, Srijan, Spezzano, Francesca, Subrahmanian, V. S., and Faloutsos, Christos. 'Edge Weight Prediction in Weighted Signed Networks.' In IEEE International Conference on Data Mining (ICDM), pp. 221--230, 2016. [Online: https://snap.stanford.edu/data/soc-sign-bitcoin-otc.html]</w:t>
+        <w:t>[26] Kumar, Srijan, Spezzano, Francesca, Subrahmanian, V. S., and Faloutsos, Christos. 'Edge Weight Prediction in Weighted Signed Networks.' In IEEE International Conference on Data Mining (ICDM), pp. 221--230, 2016. [Dataset Link: https://snap.stanford.edu/data/soc-sign-bitcoin-otc.html]</w:t>
       </w:r>
     </w:p>
     <w:p>

</xml_diff>